<commit_message>
Avance fase 2 OfiMatch APT
</commit_message>
<xml_diff>
--- a/fase2/EvidenciasIndividuales/2.1_APT122_DiarioReflexionFase2.docx
+++ b/fase2/EvidenciasIndividuales/2.1_APT122_DiarioReflexionFase2.docx
@@ -275,7 +275,6 @@
                 <w:rFonts w:eastAsiaTheme="majorEastAsia"/>
                 <w:b/>
                 <w:bCs/>
-                <w:color w:val="767171" w:themeColor="background2" w:themeShade="80"/>
                 <w:sz w:val="24"/>
                 <w:szCs w:val="24"/>
               </w:rPr>
@@ -334,7 +333,25 @@
                 <w:sz w:val="24"/>
                 <w:szCs w:val="24"/>
               </w:rPr>
-              <w:t>No he podido cumplir completamente con todas las actividades en los tiempos definidos en la carta Gantt. Durante el desarrollo del proyecto he tenido algunas dificultades personales que han afectado mi ritmo de trabajo y me han provocado ciertos atrasos respecto a lo planificado.</w:t>
+              <w:t xml:space="preserve">He logrado avanzar en las principales funcionalidades de </w:t>
+            </w:r>
+            <w:proofErr w:type="spellStart"/>
+            <w:r>
+              <w:rPr>
+                <w:rFonts w:eastAsiaTheme="majorEastAsia"/>
+                <w:sz w:val="24"/>
+                <w:szCs w:val="24"/>
+              </w:rPr>
+              <w:t>OfiMatch</w:t>
+            </w:r>
+            <w:proofErr w:type="spellEnd"/>
+            <w:r>
+              <w:rPr>
+                <w:rFonts w:eastAsiaTheme="majorEastAsia"/>
+                <w:sz w:val="24"/>
+                <w:szCs w:val="24"/>
+              </w:rPr>
+              <w:t>, aunque algunas actividades no se realizaron dentro de los tiempos inicialmente planificados. Durante el desarrollo tuve dificultades personales y problemas de organización que provocaron algunos atrasos.</w:t>
             </w:r>
           </w:p>
           <w:p>
@@ -346,23 +363,13 @@
                 <w:szCs w:val="24"/>
               </w:rPr>
             </w:pPr>
-          </w:p>
-          <w:p>
-            <w:pPr>
-              <w:jc w:val="both"/>
+            <w:r>
               <w:rPr>
                 <w:rFonts w:eastAsiaTheme="majorEastAsia"/>
                 <w:sz w:val="24"/>
                 <w:szCs w:val="24"/>
               </w:rPr>
-            </w:pPr>
-            <w:r>
-              <w:rPr>
-                <w:rFonts w:eastAsiaTheme="majorEastAsia"/>
-                <w:sz w:val="24"/>
-                <w:szCs w:val="24"/>
-              </w:rPr>
-              <w:t>Además, en algunos momentos me ha costado avanzar debido a bloqueos mentales y a la dificultad de organizar todas las tareas del proyecto al mismo tiempo. Sin embargo, he podido continuar avanzando y retomar actividades que habían quedado pendientes. Actualmente mi objetivo es recuperar progresivamente el tiempo perdido y priorizar las tareas más importantes para cumplir con los objetivos del proyecto.</w:t>
+              <w:t>A pesar de esto, he conseguido implementar una versión funcional que incluye registro e inicio de sesión, búsqueda y filtrado de profesionales, perfiles públicos, portafolios y contacto mediante WhatsApp. Actualmente, me encuentro priorizando la documentación, las pruebas y la preparación de las evidencias para la entrega. La funcionalidad de reservas permanece pendiente.</w:t>
             </w:r>
           </w:p>
           <w:p>
@@ -370,7 +377,6 @@
               <w:jc w:val="both"/>
               <w:rPr>
                 <w:rFonts w:eastAsiaTheme="majorEastAsia"/>
-                <w:color w:val="767171" w:themeColor="background2" w:themeShade="80"/>
                 <w:sz w:val="24"/>
                 <w:szCs w:val="24"/>
               </w:rPr>
@@ -383,7 +389,6 @@
                 <w:rFonts w:ascii="Calibri" w:hAnsi="Calibri"/>
                 <w:b/>
                 <w:bCs/>
-                <w:color w:val="1F4E79" w:themeColor="accent1" w:themeShade="80"/>
               </w:rPr>
             </w:pPr>
           </w:p>
@@ -394,7 +399,6 @@
                 <w:rFonts w:ascii="Calibri" w:hAnsi="Calibri"/>
                 <w:b/>
                 <w:bCs/>
-                <w:color w:val="1F4E79" w:themeColor="accent1" w:themeShade="80"/>
               </w:rPr>
             </w:pPr>
           </w:p>
@@ -405,7 +409,6 @@
                 <w:rFonts w:ascii="Calibri" w:hAnsi="Calibri"/>
                 <w:b/>
                 <w:bCs/>
-                <w:color w:val="1F4E79" w:themeColor="accent1" w:themeShade="80"/>
               </w:rPr>
             </w:pPr>
           </w:p>
@@ -417,7 +420,6 @@
         <w:spacing w:after="0" w:line="360" w:lineRule="auto"/>
         <w:jc w:val="both"/>
         <w:rPr>
-          <w:color w:val="595959" w:themeColor="text1" w:themeTint="A6"/>
           <w:sz w:val="24"/>
           <w:szCs w:val="24"/>
           <w:lang w:eastAsia="ja-JP"/>
@@ -455,7 +457,6 @@
               <w:jc w:val="both"/>
               <w:rPr>
                 <w:rFonts w:eastAsiaTheme="majorEastAsia"/>
-                <w:color w:val="767171" w:themeColor="background2" w:themeShade="80"/>
                 <w:sz w:val="24"/>
                 <w:szCs w:val="24"/>
               </w:rPr>
@@ -483,7 +484,6 @@
                 <w:rFonts w:eastAsiaTheme="majorEastAsia"/>
                 <w:b/>
                 <w:bCs/>
-                <w:color w:val="767171" w:themeColor="background2" w:themeShade="80"/>
                 <w:sz w:val="24"/>
                 <w:szCs w:val="24"/>
               </w:rPr>
@@ -512,7 +512,7 @@
               <w:rPr>
                 <w:rFonts w:ascii="Calibri" w:hAnsi="Calibri"/>
               </w:rPr>
-              <w:t>Para enfrentar las dificultades, he intentado dividir el proyecto en tareas más pequeñas y concretas, en lugar de intentar resolver todo de una vez. Esto me permite avanzar de manera más ordenada y disminuir la sensación de estar sobrepasado por la cantidad de trabajo.</w:t>
+              <w:t>He enfrentado las dificultades dividiendo el trabajo en tareas más pequeñas y priorizando las funcionalidades esenciales del proyecto. También he procurado concentrarme en obtener una versión funcional antes de dedicar tiempo a características secundarias.</w:t>
             </w:r>
           </w:p>
           <w:p>
@@ -526,7 +526,7 @@
               <w:rPr>
                 <w:rFonts w:ascii="Calibri" w:hAnsi="Calibri"/>
               </w:rPr>
-              <w:t>También estoy priorizando las funcionalidades principales del proyecto para asegurar que exista una versión funcional antes de dedicar tiempo a aspectos secundarios. Considero que una de las principales formas de superar los bloqueos es mantener una constancia de trabajo, aunque el avance sea pequeño, y evitar dejar que una dificultad puntual termine deteniendo completamente el proyecto.</w:t>
+              <w:t>Para finalizar, planeo revisar las funcionalidades implementadas, corregir los problemas que encuentre y completar la documentación y las evidencias solicitadas. Esto me permitirá aprovechar el tiempo disponible y presentar de forma clara los resultados alcanzados.</w:t>
             </w:r>
           </w:p>
           <w:p>
@@ -536,7 +536,6 @@
                 <w:rFonts w:ascii="Calibri" w:hAnsi="Calibri"/>
                 <w:b/>
                 <w:bCs/>
-                <w:color w:val="1F4E79" w:themeColor="accent1" w:themeShade="80"/>
               </w:rPr>
             </w:pPr>
           </w:p>
@@ -547,7 +546,6 @@
                 <w:rFonts w:ascii="Calibri" w:hAnsi="Calibri"/>
                 <w:b/>
                 <w:bCs/>
-                <w:color w:val="1F4E79" w:themeColor="accent1" w:themeShade="80"/>
               </w:rPr>
             </w:pPr>
           </w:p>
@@ -559,7 +557,6 @@
         <w:spacing w:after="0" w:line="360" w:lineRule="auto"/>
         <w:jc w:val="both"/>
         <w:rPr>
-          <w:color w:val="595959" w:themeColor="text1" w:themeTint="A6"/>
           <w:sz w:val="24"/>
           <w:szCs w:val="24"/>
           <w:lang w:eastAsia="ja-JP"/>
@@ -694,7 +691,6 @@
                 <w:rFonts w:eastAsiaTheme="majorEastAsia"/>
                 <w:b/>
                 <w:bCs/>
-                <w:color w:val="767171" w:themeColor="background2" w:themeShade="80"/>
                 <w:sz w:val="24"/>
                 <w:szCs w:val="24"/>
               </w:rPr>
@@ -713,15 +709,7 @@
                 <w:sz w:val="24"/>
                 <w:szCs w:val="24"/>
               </w:rPr>
-              <w:t xml:space="preserve"> </w:t>
-            </w:r>
-            <w:r>
-              <w:rPr>
-                <w:rFonts w:eastAsiaTheme="majorEastAsia"/>
-                <w:sz w:val="24"/>
-                <w:szCs w:val="24"/>
-              </w:rPr>
-              <w:t>¿Cómo evalúas tu trabajo? ¿Qué destacas y qué podrías hacer para mejorar tu trabajo?</w:t>
+              <w:t xml:space="preserve"> ¿Cómo evalúas tu trabajo? ¿Qué destacas y qué podrías hacer para mejorar tu trabajo?</w:t>
             </w:r>
           </w:p>
         </w:tc>
@@ -743,7 +731,6 @@
                 <w:rFonts w:ascii="Calibri" w:hAnsi="Calibri"/>
                 <w:b/>
                 <w:bCs/>
-                <w:color w:val="1F4E79" w:themeColor="accent1" w:themeShade="80"/>
               </w:rPr>
             </w:pPr>
             <w:r>
@@ -751,9 +738,8 @@
                 <w:rFonts w:ascii="Calibri" w:hAnsi="Calibri"/>
                 <w:b/>
                 <w:bCs/>
-                <w:color w:val="1F4E79" w:themeColor="accent1" w:themeShade="80"/>
-              </w:rPr>
-              <w:t xml:space="preserve">Considero que mi trabajo hasta el momento ha sido positivo en cuanto a la idea y al desarrollo que he logrado realizar, pero reconozco que podría haber tenido una mejor organización de los tiempos. Destaco principalmente que, a pesar de los atrasos y dificultades, he seguido trabajando en el proyecto y he logrado avanzar en aspectos importantes como el diseño de la base de datos, el desarrollo del </w:t>
+              </w:rPr>
+              <w:t xml:space="preserve">Considero que mi trabajo ha sido positivo, ya que logré desarrollar una versión funcional de </w:t>
             </w:r>
             <w:proofErr w:type="spellStart"/>
             <w:r>
@@ -761,7 +747,78 @@
                 <w:rFonts w:ascii="Calibri" w:hAnsi="Calibri"/>
                 <w:b/>
                 <w:bCs/>
-                <w:color w:val="1F4E79" w:themeColor="accent1" w:themeShade="80"/>
+              </w:rPr>
+              <w:t>OfiMatch</w:t>
+            </w:r>
+            <w:proofErr w:type="spellEnd"/>
+            <w:r>
+              <w:rPr>
+                <w:rFonts w:ascii="Calibri" w:hAnsi="Calibri"/>
+                <w:b/>
+                <w:bCs/>
+              </w:rPr>
+              <w:t xml:space="preserve"> utilizando </w:t>
+            </w:r>
+            <w:proofErr w:type="spellStart"/>
+            <w:r>
+              <w:rPr>
+                <w:rFonts w:ascii="Calibri" w:hAnsi="Calibri"/>
+                <w:b/>
+                <w:bCs/>
+              </w:rPr>
+              <w:t>React</w:t>
+            </w:r>
+            <w:proofErr w:type="spellEnd"/>
+            <w:r>
+              <w:rPr>
+                <w:rFonts w:ascii="Calibri" w:hAnsi="Calibri"/>
+                <w:b/>
+                <w:bCs/>
+              </w:rPr>
+              <w:t xml:space="preserve">, </w:t>
+            </w:r>
+            <w:proofErr w:type="spellStart"/>
+            <w:r>
+              <w:rPr>
+                <w:rFonts w:ascii="Calibri" w:hAnsi="Calibri"/>
+                <w:b/>
+                <w:bCs/>
+              </w:rPr>
+              <w:t>FastAPI</w:t>
+            </w:r>
+            <w:proofErr w:type="spellEnd"/>
+            <w:r>
+              <w:rPr>
+                <w:rFonts w:ascii="Calibri" w:hAnsi="Calibri"/>
+                <w:b/>
+                <w:bCs/>
+              </w:rPr>
+              <w:t xml:space="preserve"> y PostgreSQL. Destaco especialmente la integración entre el </w:t>
+            </w:r>
+            <w:proofErr w:type="spellStart"/>
+            <w:r>
+              <w:rPr>
+                <w:rFonts w:ascii="Calibri" w:hAnsi="Calibri"/>
+                <w:b/>
+                <w:bCs/>
+              </w:rPr>
+              <w:t>frontend</w:t>
+            </w:r>
+            <w:proofErr w:type="spellEnd"/>
+            <w:r>
+              <w:rPr>
+                <w:rFonts w:ascii="Calibri" w:hAnsi="Calibri"/>
+                <w:b/>
+                <w:bCs/>
+              </w:rPr>
+              <w:t xml:space="preserve">, el </w:t>
+            </w:r>
+            <w:proofErr w:type="spellStart"/>
+            <w:r>
+              <w:rPr>
+                <w:rFonts w:ascii="Calibri" w:hAnsi="Calibri"/>
+                <w:b/>
+                <w:bCs/>
               </w:rPr>
               <w:t>backend</w:t>
             </w:r>
@@ -771,29 +828,8 @@
                 <w:rFonts w:ascii="Calibri" w:hAnsi="Calibri"/>
                 <w:b/>
                 <w:bCs/>
-                <w:color w:val="1F4E79" w:themeColor="accent1" w:themeShade="80"/>
-              </w:rPr>
-              <w:t xml:space="preserve">, el </w:t>
-            </w:r>
-            <w:proofErr w:type="spellStart"/>
-            <w:r>
-              <w:rPr>
-                <w:rFonts w:ascii="Calibri" w:hAnsi="Calibri"/>
-                <w:b/>
-                <w:bCs/>
-                <w:color w:val="1F4E79" w:themeColor="accent1" w:themeShade="80"/>
-              </w:rPr>
-              <w:t>frontend</w:t>
-            </w:r>
-            <w:proofErr w:type="spellEnd"/>
-            <w:r>
-              <w:rPr>
-                <w:rFonts w:ascii="Calibri" w:hAnsi="Calibri"/>
-                <w:b/>
-                <w:bCs/>
-                <w:color w:val="1F4E79" w:themeColor="accent1" w:themeShade="80"/>
-              </w:rPr>
-              <w:t xml:space="preserve"> y la conexión entre ambos.</w:t>
+              </w:rPr>
+              <w:t xml:space="preserve"> y la base de datos, además de las funcionalidades de búsqueda, perfiles de profesionales, portafolios y contacto por WhatsApp.</w:t>
             </w:r>
           </w:p>
           <w:p>
@@ -803,7 +839,6 @@
                 <w:rFonts w:ascii="Calibri" w:hAnsi="Calibri"/>
                 <w:b/>
                 <w:bCs/>
-                <w:color w:val="1F4E79" w:themeColor="accent1" w:themeShade="80"/>
               </w:rPr>
             </w:pPr>
             <w:r>
@@ -811,9 +846,8 @@
                 <w:rFonts w:ascii="Calibri" w:hAnsi="Calibri"/>
                 <w:b/>
                 <w:bCs/>
-                <w:color w:val="1F4E79" w:themeColor="accent1" w:themeShade="80"/>
-              </w:rPr>
-              <w:t>Para mejorar, necesito organizar mejor mis tiempos, establecer objetivos pequeños para cada sesión de trabajo y evitar que los bloqueos mentales me hagan postergar demasiado una tarea. También considero importante pedir orientación cuando una dificultad me impida avanzar durante mucho tiempo.</w:t>
+              </w:rPr>
+              <w:t>Sin embargo, reconozco que podría haber organizado mejor mis tiempos y distribuido las tareas de manera más constante. Para mejorar, necesito planificar objetivos concretos, realizar pruebas con mayor anticipación y mantener un registro ordenado de los avances y pendientes.</w:t>
             </w:r>
           </w:p>
           <w:p>
@@ -823,18 +857,6 @@
                 <w:rFonts w:ascii="Calibri" w:hAnsi="Calibri"/>
                 <w:b/>
                 <w:bCs/>
-                <w:color w:val="1F4E79" w:themeColor="accent1" w:themeShade="80"/>
-              </w:rPr>
-            </w:pPr>
-          </w:p>
-          <w:p>
-            <w:pPr>
-              <w:jc w:val="both"/>
-              <w:rPr>
-                <w:rFonts w:ascii="Calibri" w:hAnsi="Calibri"/>
-                <w:b/>
-                <w:bCs/>
-                <w:color w:val="1F4E79" w:themeColor="accent1" w:themeShade="80"/>
               </w:rPr>
             </w:pPr>
           </w:p>
@@ -846,7 +868,6 @@
         <w:spacing w:after="0" w:line="360" w:lineRule="auto"/>
         <w:jc w:val="both"/>
         <w:rPr>
-          <w:color w:val="595959" w:themeColor="text1" w:themeTint="A6"/>
           <w:sz w:val="24"/>
           <w:szCs w:val="24"/>
           <w:lang w:eastAsia="ja-JP"/>
@@ -902,7 +923,6 @@
               <w:jc w:val="both"/>
               <w:rPr>
                 <w:rFonts w:eastAsiaTheme="majorEastAsia"/>
-                <w:color w:val="767171" w:themeColor="background2" w:themeShade="80"/>
                 <w:sz w:val="24"/>
                 <w:szCs w:val="24"/>
               </w:rPr>
@@ -922,7 +942,6 @@
                 <w:rFonts w:eastAsiaTheme="majorEastAsia"/>
                 <w:b/>
                 <w:bCs/>
-                <w:color w:val="767171" w:themeColor="background2" w:themeShade="80"/>
                 <w:sz w:val="24"/>
                 <w:szCs w:val="24"/>
               </w:rPr>
@@ -947,7 +966,6 @@
                 <w:rFonts w:ascii="Calibri" w:hAnsi="Calibri"/>
                 <w:b/>
                 <w:bCs/>
-                <w:color w:val="1F4E79" w:themeColor="accent1" w:themeShade="80"/>
               </w:rPr>
             </w:pPr>
             <w:r>
@@ -955,9 +973,8 @@
                 <w:rFonts w:ascii="Calibri" w:hAnsi="Calibri"/>
                 <w:b/>
                 <w:bCs/>
-                <w:color w:val="1F4E79" w:themeColor="accent1" w:themeShade="80"/>
-              </w:rPr>
-              <w:t>Mi principal inquietud es cómo priorizar correctamente las actividades restantes considerando el tiempo disponible. Quiero asegurar que las funcionalidades principales del proyecto queden correctamente implementadas antes de dedicar tiempo a detalles secundarios.</w:t>
+              </w:rPr>
+              <w:t>Mi principal inquietud es determinar qué aspectos deben priorizarse para la entrega final, considerando el tiempo disponible y las funcionalidades que todavía están pendientes. Me gustaría asegurar que el proyecto cumpla sus objetivos principales y que la documentación y las evidencias sean suficientes para demostrar el trabajo realizado.</w:t>
             </w:r>
           </w:p>
           <w:p>
@@ -967,7 +984,6 @@
                 <w:rFonts w:ascii="Calibri" w:hAnsi="Calibri"/>
                 <w:b/>
                 <w:bCs/>
-                <w:color w:val="1F4E79" w:themeColor="accent1" w:themeShade="80"/>
               </w:rPr>
             </w:pPr>
             <w:r>
@@ -975,9 +991,8 @@
                 <w:rFonts w:ascii="Calibri" w:hAnsi="Calibri"/>
                 <w:b/>
                 <w:bCs/>
-                <w:color w:val="1F4E79" w:themeColor="accent1" w:themeShade="80"/>
-              </w:rPr>
-              <w:t>Una pregunta que me gustaría realizar al docente es: ¿qué aspectos del proyecto deberían tener mayor prioridad en esta etapa para asegurar que el resultado final cumpla adecuadamente con los objetivos del APT?</w:t>
+              </w:rPr>
+              <w:t>Una pregunta que me gustaría plantear al docente es: ¿qué aspectos deberían priorizarse en la evaluación final para demostrar adecuadamente el cumplimiento de los objetivos del proyecto?</w:t>
             </w:r>
           </w:p>
           <w:p>
@@ -987,40 +1002,6 @@
                 <w:rFonts w:ascii="Calibri" w:hAnsi="Calibri"/>
                 <w:b/>
                 <w:bCs/>
-                <w:color w:val="1F4E79" w:themeColor="accent1" w:themeShade="80"/>
-              </w:rPr>
-            </w:pPr>
-          </w:p>
-          <w:p>
-            <w:pPr>
-              <w:jc w:val="both"/>
-              <w:rPr>
-                <w:rFonts w:ascii="Calibri" w:hAnsi="Calibri"/>
-                <w:b/>
-                <w:bCs/>
-                <w:color w:val="1F4E79" w:themeColor="accent1" w:themeShade="80"/>
-              </w:rPr>
-            </w:pPr>
-          </w:p>
-          <w:p>
-            <w:pPr>
-              <w:jc w:val="both"/>
-              <w:rPr>
-                <w:rFonts w:ascii="Calibri" w:hAnsi="Calibri"/>
-                <w:b/>
-                <w:bCs/>
-                <w:color w:val="1F4E79" w:themeColor="accent1" w:themeShade="80"/>
-              </w:rPr>
-            </w:pPr>
-          </w:p>
-          <w:p>
-            <w:pPr>
-              <w:jc w:val="both"/>
-              <w:rPr>
-                <w:rFonts w:ascii="Calibri" w:hAnsi="Calibri"/>
-                <w:b/>
-                <w:bCs/>
-                <w:color w:val="1F4E79" w:themeColor="accent1" w:themeShade="80"/>
               </w:rPr>
             </w:pPr>
           </w:p>
@@ -1141,7 +1122,6 @@
               <w:jc w:val="both"/>
               <w:rPr>
                 <w:rFonts w:eastAsiaTheme="majorEastAsia"/>
-                <w:color w:val="767171" w:themeColor="background2" w:themeShade="80"/>
                 <w:sz w:val="24"/>
                 <w:szCs w:val="24"/>
               </w:rPr>
@@ -1149,12 +1129,10 @@
             <w:r>
               <w:rPr>
                 <w:rFonts w:eastAsiaTheme="majorEastAsia"/>
-                <w:color w:val="767171" w:themeColor="background2" w:themeShade="80"/>
                 <w:sz w:val="24"/>
                 <w:szCs w:val="24"/>
               </w:rPr>
-              <w:lastRenderedPageBreak/>
-              <w:t>En mi caso, al estar desarrollando el proyecto de manera individual, no corresponde redistribuir actividades entre miembros del grupo. Sin embargo, sí considero necesario reorganizar las actividades pendientes y priorizarlas según su importancia para el funcionamiento del proyecto.</w:t>
+              <w:t>Al desarrollar el proyecto de manera individual, no corresponde redistribuir actividades entre integrantes. Sin embargo, sí ha sido necesario reorganizar las tareas pendientes según su importancia.</w:t>
             </w:r>
           </w:p>
           <w:p>
@@ -1162,7 +1140,33 @@
               <w:jc w:val="both"/>
               <w:rPr>
                 <w:rFonts w:eastAsiaTheme="majorEastAsia"/>
-                <w:color w:val="767171" w:themeColor="background2" w:themeShade="80"/>
+                <w:sz w:val="24"/>
+                <w:szCs w:val="24"/>
+              </w:rPr>
+            </w:pPr>
+            <w:r>
+              <w:rPr>
+                <w:rFonts w:eastAsiaTheme="majorEastAsia"/>
+                <w:sz w:val="24"/>
+                <w:szCs w:val="24"/>
+              </w:rPr>
+              <w:t xml:space="preserve">En esta etapa, considero prioritario revisar el funcionamiento de las características implementadas, completar la documentación y preparar las evidencias para la presentación. La funcionalidad de </w:t>
+            </w:r>
+            <w:r>
+              <w:rPr>
+                <w:rFonts w:eastAsiaTheme="majorEastAsia"/>
+                <w:sz w:val="24"/>
+                <w:szCs w:val="24"/>
+              </w:rPr>
+              <w:lastRenderedPageBreak/>
+              <w:t>reservas queda como una mejora pendiente, en lugar de incorporarla a última hora y arriesgar la estabilidad de lo que ya funciona.</w:t>
+            </w:r>
+          </w:p>
+          <w:p>
+            <w:pPr>
+              <w:jc w:val="both"/>
+              <w:rPr>
+                <w:rFonts w:eastAsiaTheme="majorEastAsia"/>
                 <w:sz w:val="24"/>
                 <w:szCs w:val="24"/>
               </w:rPr>
@@ -1173,7 +1177,6 @@
               <w:jc w:val="both"/>
               <w:rPr>
                 <w:rFonts w:eastAsiaTheme="majorEastAsia"/>
-                <w:color w:val="767171" w:themeColor="background2" w:themeShade="80"/>
                 <w:sz w:val="24"/>
                 <w:szCs w:val="24"/>
               </w:rPr>
@@ -1181,7 +1184,6 @@
             <w:r>
               <w:rPr>
                 <w:rFonts w:eastAsiaTheme="majorEastAsia"/>
-                <w:color w:val="767171" w:themeColor="background2" w:themeShade="80"/>
                 <w:sz w:val="24"/>
                 <w:szCs w:val="24"/>
               </w:rPr>
@@ -1193,7 +1195,6 @@
               <w:jc w:val="both"/>
               <w:rPr>
                 <w:rFonts w:eastAsiaTheme="majorEastAsia"/>
-                <w:color w:val="767171" w:themeColor="background2" w:themeShade="80"/>
                 <w:sz w:val="24"/>
                 <w:szCs w:val="24"/>
               </w:rPr>
@@ -1204,7 +1205,6 @@
               <w:jc w:val="both"/>
               <w:rPr>
                 <w:rFonts w:eastAsiaTheme="majorEastAsia"/>
-                <w:color w:val="767171" w:themeColor="background2" w:themeShade="80"/>
                 <w:sz w:val="24"/>
                 <w:szCs w:val="24"/>
               </w:rPr>
@@ -1311,16 +1311,14 @@
               </w:rPr>
               <w:t xml:space="preserve">. </w:t>
             </w:r>
-            <w:proofErr w:type="gramStart"/>
             <w:r>
               <w:rPr>
                 <w:rFonts w:eastAsiaTheme="majorEastAsia"/>
                 <w:sz w:val="24"/>
                 <w:szCs w:val="24"/>
               </w:rPr>
-              <w:t>APT  grupal</w:t>
+              <w:t>APT grupal</w:t>
             </w:r>
-            <w:proofErr w:type="gramEnd"/>
             <w:r>
               <w:rPr>
                 <w:rFonts w:eastAsiaTheme="majorEastAsia"/>
@@ -1367,7 +1365,6 @@
               <w:jc w:val="both"/>
               <w:rPr>
                 <w:rFonts w:eastAsiaTheme="majorEastAsia"/>
-                <w:color w:val="767171" w:themeColor="background2" w:themeShade="80"/>
                 <w:sz w:val="24"/>
                 <w:szCs w:val="24"/>
               </w:rPr>
@@ -1375,11 +1372,10 @@
             <w:r>
               <w:rPr>
                 <w:rFonts w:eastAsiaTheme="majorEastAsia"/>
-                <w:color w:val="767171" w:themeColor="background2" w:themeShade="80"/>
                 <w:sz w:val="24"/>
                 <w:szCs w:val="24"/>
               </w:rPr>
-              <w:t>Al realizar el proyecto de manera individual, no existe un trabajo grupal que evaluar ni una distribución de tareas entre compañeros.</w:t>
+              <w:t>Al realizar el proyecto individualmente, no existe un trabajo grupal que evaluar ni una distribución de responsabilidades entre compañeros.</w:t>
             </w:r>
           </w:p>
           <w:p>
@@ -1387,106 +1383,18 @@
               <w:jc w:val="both"/>
               <w:rPr>
                 <w:rFonts w:eastAsiaTheme="majorEastAsia"/>
-                <w:color w:val="767171" w:themeColor="background2" w:themeShade="80"/>
                 <w:sz w:val="24"/>
                 <w:szCs w:val="24"/>
               </w:rPr>
             </w:pPr>
-          </w:p>
-          <w:p>
-            <w:pPr>
-              <w:jc w:val="both"/>
+            <w:r>
               <w:rPr>
                 <w:rFonts w:eastAsiaTheme="majorEastAsia"/>
-                <w:color w:val="767171" w:themeColor="background2" w:themeShade="80"/>
                 <w:sz w:val="24"/>
                 <w:szCs w:val="24"/>
               </w:rPr>
-            </w:pPr>
-            <w:r>
-              <w:rPr>
-                <w:rFonts w:eastAsiaTheme="majorEastAsia"/>
-                <w:color w:val="767171" w:themeColor="background2" w:themeShade="80"/>
-                <w:sz w:val="24"/>
-                <w:szCs w:val="24"/>
-              </w:rPr>
-              <w:t>Como aspecto positivo, trabajar individualmente me ha permitido tomar directamente las decisiones sobre el proyecto y avanzar de acuerdo con mis propios criterios. Al mismo tiempo, esto significa que toda la responsabilidad de planificación, desarrollo y solución de problemas recae sobre mí.</w:t>
+              <w:t>Trabajar de esta manera me ha permitido tomar directamente las decisiones de diseño y desarrollo, además de aprender a integrar distintas tecnologías. Sin embargo, también ha significado asumir toda la planificación, implementación y resolución de problemas. Considero que debo seguir mejorando la administración del tiempo y la organización de las actividades para enfrentar de mejor manera futuros proyectos.</w:t>
             </w:r>
-          </w:p>
-          <w:p>
-            <w:pPr>
-              <w:jc w:val="both"/>
-              <w:rPr>
-                <w:rFonts w:eastAsiaTheme="majorEastAsia"/>
-                <w:color w:val="767171" w:themeColor="background2" w:themeShade="80"/>
-                <w:sz w:val="24"/>
-                <w:szCs w:val="24"/>
-              </w:rPr>
-            </w:pPr>
-          </w:p>
-          <w:p>
-            <w:pPr>
-              <w:jc w:val="both"/>
-              <w:rPr>
-                <w:rFonts w:eastAsiaTheme="majorEastAsia"/>
-                <w:color w:val="767171" w:themeColor="background2" w:themeShade="80"/>
-                <w:sz w:val="24"/>
-                <w:szCs w:val="24"/>
-              </w:rPr>
-            </w:pPr>
-            <w:r>
-              <w:rPr>
-                <w:rFonts w:eastAsiaTheme="majorEastAsia"/>
-                <w:color w:val="767171" w:themeColor="background2" w:themeShade="80"/>
-                <w:sz w:val="24"/>
-                <w:szCs w:val="24"/>
-              </w:rPr>
-              <w:t>Uno de los aspectos que debo mejorar es precisamente la organización y administración del tiempo, ya que al no existir una distribución de responsabilidades tengo que mantener un mayor control sobre todas las etapas del proyecto.</w:t>
-            </w:r>
-          </w:p>
-          <w:p>
-            <w:pPr>
-              <w:jc w:val="both"/>
-              <w:rPr>
-                <w:rFonts w:eastAsiaTheme="majorEastAsia"/>
-                <w:color w:val="767171" w:themeColor="background2" w:themeShade="80"/>
-                <w:sz w:val="24"/>
-                <w:szCs w:val="24"/>
-              </w:rPr>
-            </w:pPr>
-          </w:p>
-          <w:p>
-            <w:pPr>
-              <w:jc w:val="both"/>
-              <w:rPr>
-                <w:rFonts w:eastAsiaTheme="majorEastAsia"/>
-                <w:color w:val="767171" w:themeColor="background2" w:themeShade="80"/>
-                <w:sz w:val="24"/>
-                <w:szCs w:val="24"/>
-              </w:rPr>
-            </w:pPr>
-          </w:p>
-          <w:p>
-            <w:pPr>
-              <w:jc w:val="both"/>
-              <w:rPr>
-                <w:rFonts w:eastAsiaTheme="majorEastAsia"/>
-                <w:color w:val="767171" w:themeColor="background2" w:themeShade="80"/>
-                <w:sz w:val="24"/>
-                <w:szCs w:val="24"/>
-              </w:rPr>
-            </w:pPr>
-          </w:p>
-          <w:p>
-            <w:pPr>
-              <w:jc w:val="both"/>
-              <w:rPr>
-                <w:rFonts w:eastAsiaTheme="majorEastAsia"/>
-                <w:color w:val="767171" w:themeColor="background2" w:themeShade="80"/>
-                <w:sz w:val="24"/>
-                <w:szCs w:val="24"/>
-              </w:rPr>
-            </w:pPr>
           </w:p>
           <w:p>
             <w:pPr>
@@ -8746,6 +8654,10 @@
 </file>
 
 <file path=customXml/item1.xml><?xml version="1.0" encoding="utf-8"?>
+<b:Sources xmlns:b="http://schemas.openxmlformats.org/officeDocument/2006/bibliography" xmlns="http://schemas.openxmlformats.org/officeDocument/2006/bibliography" SelectedStyle="\APASixthEditionOfficeOnline.xsl" StyleName="APA" Version="6"/>
+</file>
+
+<file path=customXml/item2.xml><?xml version="1.0" encoding="utf-8"?>
 <ct:contentTypeSchema xmlns:ct="http://schemas.microsoft.com/office/2006/metadata/contentType" xmlns:ma="http://schemas.microsoft.com/office/2006/metadata/properties/metaAttributes" ct:_="" ma:_="" ma:contentTypeName="Documento" ma:contentTypeID="0x010100E96778489EE7714D8BD12CC105EB918B" ma:contentTypeVersion="2" ma:contentTypeDescription="Crear nuevo documento." ma:contentTypeScope="" ma:versionID="416c5c7ae9b5d54d83875cd3c65194e3">
   <xsd:schema xmlns:xsd="http://www.w3.org/2001/XMLSchema" xmlns:xs="http://www.w3.org/2001/XMLSchema" xmlns:p="http://schemas.microsoft.com/office/2006/metadata/properties" xmlns:ns2="126e8a1c-9ea9-435a-ac89-d06c80d62e30" targetNamespace="http://schemas.microsoft.com/office/2006/metadata/properties" ma:root="true" ma:fieldsID="70a237c842677bd850644f8595079f5e" ns2:_="">
     <xsd:import namespace="126e8a1c-9ea9-435a-ac89-d06c80d62e30"/>
@@ -8877,11 +8789,13 @@
 </ct:contentTypeSchema>
 </file>
 
-<file path=customXml/item2.xml><?xml version="1.0" encoding="utf-8"?>
-<b:Sources xmlns:b="http://schemas.openxmlformats.org/officeDocument/2006/bibliography" xmlns="http://schemas.openxmlformats.org/officeDocument/2006/bibliography" SelectedStyle="\APASixthEditionOfficeOnline.xsl" StyleName="APA" Version="6"/>
+<file path=customXml/item3.xml><?xml version="1.0" encoding="utf-8"?>
+<p:properties xmlns:p="http://schemas.microsoft.com/office/2006/metadata/properties" xmlns:xsi="http://www.w3.org/2001/XMLSchema-instance" xmlns:pc="http://schemas.microsoft.com/office/infopath/2007/PartnerControls">
+  <documentManagement/>
+</p:properties>
 </file>
 
-<file path=customXml/item3.xml><?xml version="1.0" encoding="utf-8"?>
+<file path=customXml/item4.xml><?xml version="1.0" encoding="utf-8"?>
 <?mso-contentType ?>
 <FormTemplates xmlns="http://schemas.microsoft.com/sharepoint/v3/contenttype/forms">
   <Display>DocumentLibraryForm</Display>
@@ -8890,13 +8804,15 @@
 </FormTemplates>
 </file>
 
-<file path=customXml/item4.xml><?xml version="1.0" encoding="utf-8"?>
-<p:properties xmlns:p="http://schemas.microsoft.com/office/2006/metadata/properties" xmlns:xsi="http://www.w3.org/2001/XMLSchema-instance" xmlns:pc="http://schemas.microsoft.com/office/infopath/2007/PartnerControls">
-  <documentManagement/>
-</p:properties>
+<file path=customXml/itemProps1.xml><?xml version="1.0" encoding="utf-8"?>
+<ds:datastoreItem xmlns:ds="http://schemas.openxmlformats.org/officeDocument/2006/customXml" ds:itemID="{FBD61725-A60E-40F3-AB5D-0E7F797DD77D}">
+  <ds:schemaRefs>
+    <ds:schemaRef ds:uri="http://schemas.openxmlformats.org/officeDocument/2006/bibliography"/>
+  </ds:schemaRefs>
+</ds:datastoreItem>
 </file>
 
-<file path=customXml/itemProps1.xml><?xml version="1.0" encoding="utf-8"?>
+<file path=customXml/itemProps2.xml><?xml version="1.0" encoding="utf-8"?>
 <ds:datastoreItem xmlns:ds="http://schemas.openxmlformats.org/officeDocument/2006/customXml" ds:itemID="{DF0582E6-0C2C-40A6-8E3D-E410E41021C1}">
   <ds:schemaRefs>
     <ds:schemaRef ds:uri="http://schemas.microsoft.com/office/2006/metadata/contentType"/>
@@ -8914,27 +8830,19 @@
 </ds:datastoreItem>
 </file>
 
-<file path=customXml/itemProps2.xml><?xml version="1.0" encoding="utf-8"?>
-<ds:datastoreItem xmlns:ds="http://schemas.openxmlformats.org/officeDocument/2006/customXml" ds:itemID="{FBD61725-A60E-40F3-AB5D-0E7F797DD77D}">
-  <ds:schemaRefs>
-    <ds:schemaRef ds:uri="http://schemas.openxmlformats.org/officeDocument/2006/bibliography"/>
-  </ds:schemaRefs>
-</ds:datastoreItem>
-</file>
-
 <file path=customXml/itemProps3.xml><?xml version="1.0" encoding="utf-8"?>
-<ds:datastoreItem xmlns:ds="http://schemas.openxmlformats.org/officeDocument/2006/customXml" ds:itemID="{DABAA964-10BA-4DBC-ABF2-CDEAC0FAF7AA}">
-  <ds:schemaRefs>
-    <ds:schemaRef ds:uri="http://schemas.microsoft.com/sharepoint/v3/contenttype/forms"/>
-  </ds:schemaRefs>
-</ds:datastoreItem>
-</file>
-
-<file path=customXml/itemProps4.xml><?xml version="1.0" encoding="utf-8"?>
 <ds:datastoreItem xmlns:ds="http://schemas.openxmlformats.org/officeDocument/2006/customXml" ds:itemID="{5F1783E3-BA1C-4CA3-8E32-C9B378BBED03}">
   <ds:schemaRefs>
     <ds:schemaRef ds:uri="http://schemas.microsoft.com/office/2006/metadata/properties"/>
     <ds:schemaRef ds:uri="http://schemas.microsoft.com/office/infopath/2007/PartnerControls"/>
   </ds:schemaRefs>
 </ds:datastoreItem>
+</file>
+
+<file path=customXml/itemProps4.xml><?xml version="1.0" encoding="utf-8"?>
+<ds:datastoreItem xmlns:ds="http://schemas.openxmlformats.org/officeDocument/2006/customXml" ds:itemID="{DABAA964-10BA-4DBC-ABF2-CDEAC0FAF7AA}">
+  <ds:schemaRefs>
+    <ds:schemaRef ds:uri="http://schemas.microsoft.com/sharepoint/v3/contenttype/forms"/>
+  </ds:schemaRefs>
+</ds:datastoreItem>
 </file>
</xml_diff>